<commit_message>
Add the Bluetooth line to the PS3 cheat sheet and decks
The cheat sheet's "At the top" block now shows the include, so sketches
students write themselves start Bluetooth too. Rebuilding the L3 and L5
decks moves three line numbers that srcfacts reads from l3c and l5c.

Co-Authored-By: Claude Opus 5.5 <noreply@anthropic.com>
</commit_message>
<xml_diff>
--- a/ground-vehicle/docs/courses/beginner-ps3/handouts/coding_cheat_sheet.docx
+++ b/ground-vehicle/docs/courses/beginner-ps3/handouts/coding_cheat_sheet.docx
@@ -5844,7 +5844,7 @@
                 <w:sz w:val="17"/>
                 <w:szCs w:val="17"/>
               </w:rPr>
-              <w:t xml:space="preserve">the library, and YOUR controller's address. The number on its sticker replaces the 00.</w:t>
+              <w:t xml:space="preserve">the library, the line that keeps Bluetooth on, and YOUR controller's address. The number on its sticker replaces the 00.</w:t>
             </w:r>
           </w:p>
         </w:tc>
@@ -5865,6 +5865,19 @@
                 <w:szCs w:val="16"/>
               </w:rPr>
               <w:t xml:space="preserve">#include &lt;Ps3Controller.h&gt;</w:t>
+            </w:r>
+          </w:p>
+          <w:p>
+            <w:pPr>
+              <w:spacing w:before="0" w:after="0" w:line="240" w:lineRule="auto"/>
+            </w:pPr>
+            <w:r>
+              <w:rPr>
+                <w:rFonts w:ascii="Consolas" w:hAnsi="Consolas" w:cs="Consolas"/>
+                <w:sz w:val="16"/>
+                <w:szCs w:val="16"/>
+              </w:rPr>
+              <w:t xml:space="preserve">#include "esp32-hal-alloc-bt-classic-mem.h"   // KEEP: Bluetooth</w:t>
             </w:r>
           </w:p>
           <w:p>

</xml_diff>